<commit_message>
Feature/documents app/batch v0.1 (#42)
* id_handover v0.1

* : documents batch in progress

* batch few more fixes

* изменен UX работы с комплектами

* Добавлены замечания к актам комплекта, добавлены статусы ПРОВЕРКИ

* WIP: documents batch UI work

* Исправления реестра под того кто выполнил работы

* Add batch handover attachments

* Фикс шаблонов реестров

* Апгрейд страницы деталей комплекта

* Убран шаг 2 при создании комплекта
</commit_message>
<xml_diff>
--- a/document_templates/docx/registry_approvals.docx
+++ b/document_templates/docx/registry_approvals.docx
@@ -202,16 +202,15 @@
           <w:szCs w:val="20"/>
           <w:shd w:val="clear" w:color="auto" w:fill="FFFFFF"/>
         </w:rPr>
-        <w:t xml:space="preserve">Организация, выполнившая работы: </w:t>
-      </w:r>
-      <w:r>
-        <w:rPr>
-          <w:rFonts w:ascii="Times New Roman" w:hAnsi="Times New Roman" w:cs="Times New Roman"/>
-          <w:sz w:val="20"/>
-          <w:szCs w:val="20"/>
-          <w:shd w:val="clear" w:color="auto" w:fill="FFFFFF"/>
-        </w:rPr>
-        <w:t xml:space="preserve">ООО «СМУ-12 </w:t>
+        <w:t>Организация, выполнившая работы: {{registry_contractor_org_full}}</w:t>
+      </w:r>
+      <w:r>
+        <w:rPr>
+          <w:rFonts w:ascii="Times New Roman" w:hAnsi="Times New Roman" w:cs="Times New Roman"/>
+          <w:sz w:val="20"/>
+          <w:szCs w:val="20"/>
+          <w:shd w:val="clear" w:color="auto" w:fill="FFFFFF"/>
+        </w:rPr>
       </w:r>
       <w:proofErr w:type="spellStart"/>
       <w:r>
@@ -221,7 +220,6 @@
           <w:szCs w:val="20"/>
           <w:shd w:val="clear" w:color="auto" w:fill="FFFFFF"/>
         </w:rPr>
-        <w:t>Мосметростроя</w:t>
       </w:r>
       <w:proofErr w:type="spellEnd"/>
       <w:r>
@@ -231,7 +229,6 @@
           <w:szCs w:val="20"/>
           <w:shd w:val="clear" w:color="auto" w:fill="FFFFFF"/>
         </w:rPr>
-        <w:t>», участок №5</w:t>
       </w:r>
     </w:p>
     <w:p>
@@ -837,7 +834,7 @@
                 <w:b/>
                 <w:sz w:val="20"/>
               </w:rPr>
-              <w:t>Начальник участка №5</w:t>
+              <w:t>{{registry_signer_position}}</w:t>
             </w:r>
           </w:p>
           <w:p>
@@ -854,7 +851,7 @@
                 <w:b/>
                 <w:sz w:val="20"/>
               </w:rPr>
-              <w:t xml:space="preserve">ООО «СМУ-12 </w:t>
+              <w:t>{{registry_contractor_org_full}}</w:t>
             </w:r>
             <w:proofErr w:type="spellStart"/>
             <w:r>
@@ -863,7 +860,6 @@
                 <w:b/>
                 <w:sz w:val="20"/>
               </w:rPr>
-              <w:t>Мосметростроя</w:t>
             </w:r>
             <w:proofErr w:type="spellEnd"/>
             <w:r>
@@ -872,7 +868,6 @@
                 <w:b/>
                 <w:sz w:val="20"/>
               </w:rPr>
-              <w:t>»</w:t>
             </w:r>
           </w:p>
         </w:tc>
@@ -904,7 +899,7 @@
                 <w:b/>
                 <w:sz w:val="20"/>
               </w:rPr>
-              <w:t>Коташевич</w:t>
+              <w:t>{{registry_signer_fio}}</w:t>
             </w:r>
             <w:proofErr w:type="spellEnd"/>
             <w:r>
@@ -913,7 +908,6 @@
                 <w:b/>
                 <w:sz w:val="20"/>
               </w:rPr>
-              <w:t xml:space="preserve"> В.С.</w:t>
             </w:r>
           </w:p>
         </w:tc>

</xml_diff>